<commit_message>
chore: aktualizacja template wezwania (ręczna edycja)
Co-Authored-By: Claude Opus 4.7 (1M context) <noreply@anthropic.com>
</commit_message>
<xml_diff>
--- a/demand_generator/templates/wezwanie_template.docx
+++ b/demand_generator/templates/wezwanie_template.docx
@@ -554,7 +554,7 @@
           <w:sz w:val="24"/>
           <w:szCs w:val="24"/>
         </w:rPr>
-        <w:t>oraz ust. 3 ustawy z dnia 8 marca 2013 r. o</w:t>
+        <w:t>ustawy z dnia 8 marca 2013 r. o</w:t>
       </w:r>
       <w:r>
         <w:rPr>
@@ -656,7 +656,7 @@
           <w:sz w:val="24"/>
           <w:szCs w:val="24"/>
         </w:rPr>
-        <w:t>, wyliczone na dzień sporządzenia wezwania.</w:t>
+        <w:t>.</w:t>
       </w:r>
     </w:p>
     <w:p>
@@ -809,201 +809,6 @@
         </w:rPr>
         <w:lastRenderedPageBreak/>
         <w:t>Liczę na szybkie i ostateczne zakończenie sprawy.</w:t>
-      </w:r>
-    </w:p>
-    <w:p>
-      <w:pPr>
-        <w:spacing w:after="0" w:line="300" w:lineRule="auto"/>
-        <w:rPr>
-          <w:rFonts w:ascii="Times New Roman" w:eastAsia="Times New Roman" w:hAnsi="Times New Roman" w:cs="Times New Roman"/>
-          <w:color w:val="000000" w:themeColor="text1"/>
-          <w:sz w:val="24"/>
-          <w:szCs w:val="24"/>
-        </w:rPr>
-      </w:pPr>
-    </w:p>
-    <w:p>
-      <w:pPr>
-        <w:spacing w:after="0" w:line="300" w:lineRule="auto"/>
-        <w:rPr>
-          <w:rFonts w:ascii="Times New Roman" w:eastAsia="Times New Roman" w:hAnsi="Times New Roman" w:cs="Times New Roman"/>
-          <w:color w:val="000000" w:themeColor="text1"/>
-          <w:sz w:val="24"/>
-          <w:szCs w:val="24"/>
-        </w:rPr>
-      </w:pPr>
-    </w:p>
-    <w:p>
-      <w:pPr>
-        <w:spacing w:after="0" w:line="300" w:lineRule="auto"/>
-        <w:rPr>
-          <w:rFonts w:ascii="Times New Roman" w:eastAsia="Times New Roman" w:hAnsi="Times New Roman" w:cs="Times New Roman"/>
-          <w:color w:val="000000" w:themeColor="text1"/>
-          <w:sz w:val="24"/>
-          <w:szCs w:val="24"/>
-        </w:rPr>
-      </w:pPr>
-    </w:p>
-    <w:p>
-      <w:pPr>
-        <w:spacing w:after="0" w:line="300" w:lineRule="auto"/>
-        <w:rPr>
-          <w:rFonts w:ascii="Times New Roman" w:eastAsia="Times New Roman" w:hAnsi="Times New Roman" w:cs="Times New Roman"/>
-          <w:color w:val="000000" w:themeColor="text1"/>
-          <w:sz w:val="24"/>
-          <w:szCs w:val="24"/>
-        </w:rPr>
-      </w:pPr>
-    </w:p>
-    <w:p>
-      <w:pPr>
-        <w:spacing w:after="0" w:line="300" w:lineRule="auto"/>
-        <w:rPr>
-          <w:rFonts w:ascii="Times New Roman" w:eastAsia="Times New Roman" w:hAnsi="Times New Roman" w:cs="Times New Roman"/>
-          <w:color w:val="000000" w:themeColor="text1"/>
-          <w:sz w:val="24"/>
-          <w:szCs w:val="24"/>
-        </w:rPr>
-      </w:pPr>
-    </w:p>
-    <w:p>
-      <w:pPr>
-        <w:spacing w:after="0" w:line="300" w:lineRule="auto"/>
-        <w:rPr>
-          <w:rFonts w:ascii="Times New Roman" w:eastAsia="Times New Roman" w:hAnsi="Times New Roman" w:cs="Times New Roman"/>
-          <w:color w:val="000000" w:themeColor="text1"/>
-          <w:sz w:val="24"/>
-          <w:szCs w:val="24"/>
-        </w:rPr>
-      </w:pPr>
-    </w:p>
-    <w:p>
-      <w:pPr>
-        <w:spacing w:after="0" w:line="300" w:lineRule="auto"/>
-        <w:rPr>
-          <w:rFonts w:ascii="Times New Roman" w:eastAsia="Times New Roman" w:hAnsi="Times New Roman" w:cs="Times New Roman"/>
-          <w:color w:val="000000" w:themeColor="text1"/>
-          <w:sz w:val="24"/>
-          <w:szCs w:val="24"/>
-        </w:rPr>
-      </w:pPr>
-    </w:p>
-    <w:p>
-      <w:pPr>
-        <w:spacing w:after="0" w:line="300" w:lineRule="auto"/>
-        <w:rPr>
-          <w:rFonts w:ascii="Times New Roman" w:eastAsia="Times New Roman" w:hAnsi="Times New Roman" w:cs="Times New Roman"/>
-          <w:color w:val="000000" w:themeColor="text1"/>
-          <w:sz w:val="24"/>
-          <w:szCs w:val="24"/>
-        </w:rPr>
-      </w:pPr>
-    </w:p>
-    <w:p>
-      <w:pPr>
-        <w:spacing w:after="0" w:line="300" w:lineRule="auto"/>
-        <w:rPr>
-          <w:rFonts w:ascii="Times New Roman" w:eastAsia="Times New Roman" w:hAnsi="Times New Roman" w:cs="Times New Roman"/>
-          <w:b/>
-          <w:bCs/>
-          <w:color w:val="000000" w:themeColor="text1"/>
-          <w:sz w:val="20"/>
-          <w:szCs w:val="20"/>
-        </w:rPr>
-      </w:pPr>
-      <w:r>
-        <w:rPr>
-          <w:rFonts w:ascii="Times New Roman" w:eastAsia="Times New Roman" w:hAnsi="Times New Roman" w:cs="Times New Roman"/>
-          <w:b/>
-          <w:bCs/>
-          <w:color w:val="000000" w:themeColor="text1"/>
-          <w:sz w:val="20"/>
-          <w:szCs w:val="20"/>
-        </w:rPr>
-        <w:t>Załączniki:</w:t>
-      </w:r>
-    </w:p>
-    <w:p>
-      <w:pPr>
-        <w:pStyle w:val="Akapitzlist"/>
-        <w:numPr>
-          <w:ilvl w:val="0"/>
-          <w:numId w:val="4"/>
-        </w:numPr>
-        <w:spacing w:after="0" w:line="300" w:lineRule="auto"/>
-        <w:ind w:left="284" w:hanging="284"/>
-        <w:rPr>
-          <w:rFonts w:ascii="Times New Roman" w:eastAsia="Times New Roman" w:hAnsi="Times New Roman" w:cs="Times New Roman"/>
-          <w:color w:val="000000" w:themeColor="text1"/>
-          <w:sz w:val="20"/>
-          <w:szCs w:val="20"/>
-        </w:rPr>
-      </w:pPr>
-      <w:r>
-        <w:rPr>
-          <w:rFonts w:ascii="Times New Roman" w:eastAsia="Times New Roman" w:hAnsi="Times New Roman" w:cs="Times New Roman"/>
-          <w:color w:val="000000" w:themeColor="text1"/>
-          <w:sz w:val="20"/>
-          <w:szCs w:val="20"/>
-        </w:rPr>
-        <w:t>pełnomocnictwo;</w:t>
-      </w:r>
-    </w:p>
-    <w:p>
-      <w:pPr>
-        <w:pStyle w:val="Akapitzlist"/>
-        <w:numPr>
-          <w:ilvl w:val="0"/>
-          <w:numId w:val="4"/>
-        </w:numPr>
-        <w:spacing w:after="0" w:line="300" w:lineRule="auto"/>
-        <w:ind w:left="284" w:hanging="284"/>
-        <w:rPr>
-          <w:color w:val="000000" w:themeColor="text1"/>
-          <w:sz w:val="20"/>
-          <w:szCs w:val="20"/>
-        </w:rPr>
-      </w:pPr>
-      <w:r>
-        <w:rPr>
-          <w:rFonts w:ascii="Times New Roman" w:eastAsia="Times New Roman" w:hAnsi="Times New Roman" w:cs="Times New Roman"/>
-          <w:color w:val="000000" w:themeColor="text1"/>
-          <w:sz w:val="20"/>
-          <w:szCs w:val="20"/>
-        </w:rPr>
-        <w:t>KRS wierzyciela.</w:t>
-      </w:r>
-    </w:p>
-    <w:p>
-      <w:pPr>
-        <w:spacing w:after="0" w:line="300" w:lineRule="auto"/>
-        <w:rPr>
-          <w:color w:val="000000" w:themeColor="text1"/>
-        </w:rPr>
-      </w:pPr>
-    </w:p>
-    <w:p>
-      <w:pPr>
-        <w:spacing w:after="0" w:line="300" w:lineRule="auto"/>
-        <w:rPr>
-          <w:rFonts w:ascii="Times New Roman" w:hAnsi="Times New Roman" w:cs="Times New Roman"/>
-          <w:b/>
-          <w:bCs/>
-          <w:color w:val="000000" w:themeColor="text1"/>
-          <w:sz w:val="24"/>
-          <w:szCs w:val="24"/>
-        </w:rPr>
-      </w:pPr>
-      <w:r>
-        <w:rPr>
-          <w:rFonts w:ascii="Times New Roman" w:hAnsi="Times New Roman" w:cs="Times New Roman"/>
-          <w:b/>
-          <w:bCs/>
-          <w:color w:val="000000" w:themeColor="text1"/>
-          <w:sz w:val="24"/>
-          <w:szCs w:val="24"/>
-        </w:rPr>
-        <w:t>ZPO</w:t>
       </w:r>
     </w:p>
     <w:sectPr>
@@ -2503,6 +2308,7 @@
   <w:style w:type="character" w:default="1" w:styleId="Domylnaczcionkaakapitu">
     <w:name w:val="Default Paragraph Font"/>
     <w:uiPriority w:val="1"/>
+    <w:semiHidden/>
     <w:unhideWhenUsed/>
   </w:style>
   <w:style w:type="table" w:default="1" w:styleId="Standardowy">

</xml_diff>